<commit_message>
update: made some changes to portfolio
</commit_message>
<xml_diff>
--- a/public/My_CV.docx
+++ b/public/My_CV.docx
@@ -201,7 +201,10 @@
         <w:t>🌐</w:t>
       </w:r>
       <w:r>
-        <w:t xml:space="preserve">  www.portfolio.com</w:t>
+        <w:t xml:space="preserve">  </w:t>
+      </w:r>
+      <w:r>
+        <w:t>https://iam-akpoyovware-israel.vercel.app/</w:t>
       </w:r>
       <w:proofErr w:type="gramEnd"/>
     </w:p>
@@ -1410,23 +1413,7 @@
                 <w:sz w:val="24"/>
                 <w:szCs w:val="24"/>
               </w:rPr>
-              <w:t xml:space="preserve"> on frontend projects </w:t>
-            </w:r>
-            <w:proofErr w:type="spellStart"/>
-            <w:r>
-              <w:rPr>
-                <w:sz w:val="24"/>
-                <w:szCs w:val="24"/>
-              </w:rPr>
-              <w:t>e.g</w:t>
-            </w:r>
-            <w:proofErr w:type="spellEnd"/>
-            <w:r>
-              <w:rPr>
-                <w:sz w:val="24"/>
-                <w:szCs w:val="24"/>
-              </w:rPr>
-              <w:t xml:space="preserve"> building a responsive real estate website, </w:t>
+              <w:t xml:space="preserve"> on frontend projects e.g building a responsive real estate website, </w:t>
             </w:r>
             <w:r>
               <w:rPr>

</xml_diff>